<commit_message>
templates: pin Noto Sans Gujarati for Indic text, keep Latin face for English
Gujarati/Devanagari runs get Noto in all four rFonts slots (ascii/hAnsi/cs/
eastAsia); Latin-only runs and the docDefaults keep their original Latin face
and only route complex-script (w:cs) to Noto. Bundle the .ttf (SIL OFL) under
fonts/ and document install steps in the README.

Co-Authored-By: Claude Opus 4.8 (1M context) <noreply@anthropic.com>
</commit_message>
<xml_diff>
--- a/templates/medical_letter.docx
+++ b/templates/medical_letter.docx
@@ -5,6 +5,7 @@
     <w:p>
       <w:r>
         <w:rPr>
+          <w:rFonts w:cs="Noto Sans Gujarati"/>
           <w:b w:val="0"/>
         </w:rPr>
         <w:t>To,</w:t>
@@ -13,6 +14,7 @@
     <w:p>
       <w:r>
         <w:rPr>
+          <w:rFonts w:cs="Noto Sans Gujarati"/>
           <w:b w:val="0"/>
         </w:rPr>
         <w:t>The Medical Officer,</w:t>
@@ -21,6 +23,7 @@
     <w:p>
       <w:r>
         <w:rPr>
+          <w:rFonts w:cs="Noto Sans Gujarati"/>
           <w:b w:val="0"/>
         </w:rPr>
         <w:t>{{ hospital }}.</w:t>
@@ -33,6 +36,7 @@
       </w:pPr>
       <w:r>
         <w:rPr>
+          <w:rFonts w:cs="Noto Sans Gujarati"/>
           <w:b/>
           <w:sz w:val="28"/>
         </w:rPr>
@@ -43,6 +47,7 @@
     <w:p>
       <w:r>
         <w:rPr>
+          <w:rFonts w:cs="Noto Sans Gujarati"/>
           <w:b w:val="0"/>
         </w:rPr>
         <w:t>From: {{ io_name }}, Investigating Officer, {{ police_station }}, {{ district }}.</w:t>
@@ -51,6 +56,7 @@
     <w:p>
       <w:r>
         <w:rPr>
+          <w:rFonts w:cs="Noto Sans Gujarati"/>
           <w:b w:val="0"/>
         </w:rPr>
         <w:t>Case / FIR No.: {{ case_number }}  (FIR No. {{ fir_number }})</w:t>
@@ -60,6 +66,7 @@
     <w:p>
       <w:r>
         <w:rPr>
+          <w:rFonts w:cs="Noto Sans Gujarati"/>
           <w:b w:val="0"/>
         </w:rPr>
         <w:t>Sir / Madam,</w:t>
@@ -68,6 +75,7 @@
     <w:p>
       <w:r>
         <w:rPr>
+          <w:rFonts w:cs="Noto Sans Gujarati"/>
           <w:b w:val="0"/>
         </w:rPr>
         <w:t>In connection with the above case, {{ subject_name }} ({{ subject_role }}) is being produced before you. You are requested to conduct the medical examination of the said person for the following purpose:</w:t>
@@ -76,6 +84,7 @@
     <w:p>
       <w:r>
         <w:rPr>
+          <w:rFonts w:ascii="Noto Sans Gujarati" w:hAnsi="Noto Sans Gujarati" w:cs="Noto Sans Gujarati" w:eastAsia="Noto Sans Gujarati"/>
           <w:b w:val="0"/>
         </w:rPr>
         <w:t>Purpose of examination: {{ examination_purpose }}</w:t>
@@ -85,6 +94,7 @@
     <w:p>
       <w:r>
         <w:rPr>
+          <w:rFonts w:cs="Noto Sans Gujarati"/>
           <w:b w:val="0"/>
         </w:rPr>
         <w:t>You are further requested to furnish the medical examination report and certificate to this office at the earliest for the purpose of investigation.</w:t>
@@ -107,6 +117,9 @@
           </w:tcPr>
           <w:p>
             <w:r>
+              <w:rPr>
+                <w:rFonts w:cs="Noto Sans Gujarati"/>
+              </w:rPr>
               <w:t>Place: {{ police_station }}</w:t>
             </w:r>
           </w:p>
@@ -120,6 +133,9 @@
               <w:jc w:val="right"/>
             </w:pPr>
             <w:r>
+              <w:rPr>
+                <w:rFonts w:cs="Noto Sans Gujarati"/>
+              </w:rPr>
               <w:t>{{ io_name }}</w:t>
               <w:br/>
               <w:t>Investigating Officer</w:t>
@@ -131,6 +147,7 @@
     <w:p>
       <w:r>
         <w:rPr>
+          <w:rFonts w:cs="Noto Sans Gujarati"/>
           <w:b w:val="0"/>
         </w:rPr>
         <w:t>NOTE: Draft generated by CrimeGPT — to be verified and signed by the officer.</w:t>
@@ -354,7 +371,7 @@
   <w:docDefaults>
     <w:rPrDefault>
       <w:rPr>
-        <w:rFonts w:asciiTheme="minorHAnsi" w:eastAsiaTheme="minorEastAsia" w:hAnsiTheme="minorHAnsi" w:cstheme="minorBidi"/>
+        <w:rFonts w:asciiTheme="minorHAnsi" w:eastAsiaTheme="minorEastAsia" w:hAnsiTheme="minorHAnsi" w:cs="Noto Sans Gujarati"/>
         <w:sz w:val="22"/>
         <w:szCs w:val="22"/>
         <w:lang w:val="en-US" w:eastAsia="en-US" w:bidi="ar-SA"/>

</xml_diff>